<commit_message>
Add real supplier purchase links (Alibaba/Mouser/LCSC) to internal Kwati cost breakdown
</commit_message>
<xml_diff>
--- a/kwati_current/KWATI_500K_INTERNAL_COST_BREAKDOWN.docx
+++ b/kwati_current/KWATI_500K_INTERNAL_COST_BREAKDOWN.docx
@@ -2904,6 +2904,594 @@
         <w:t>Full 4-zone, 18-month program (for future planning, not currently asked for): hardware $52,632 standard / $35,658 cheaper, plus personnel $242,750, plus the non-hardware Niger-style line items scaled across 4 zones — giving a realistic full-program range in the $650,000–$750,000 band once Kaduna/Benue/Edo licensing, transport, offices and security ops are added on top of Niger's figures. This is a working estimate for your internal use; happy to build out the full itemized Kaduna/Benue/Edo version if you want to actually raise for the whole 18 months in one go instead of staging it.</w:t>
       </w:r>
     </w:p>
+    <w:p>
+      <w:pPr>
+        <w:spacing w:before="120" w:after="200"/>
+      </w:pPr>
+      <w:r>
+        <w:rPr>
+          <w:color w:val="AAAAAA"/>
+          <w:sz w:val="14"/>
+        </w:rPr>
+        <w:t>──────────────────────────────────────────────────────────────────────</w:t>
+      </w:r>
+    </w:p>
+    <w:p>
+      <w:pPr>
+        <w:spacing w:before="320" w:after="120"/>
+      </w:pPr>
+      <w:r>
+        <w:rPr>
+          <w:b/>
+          <w:color w:val="0B1F3A"/>
+          <w:sz w:val="26"/>
+        </w:rPr>
+        <w:t>7. Where To Actually Buy Each Component (Live Supplier Links)</w:t>
+      </w:r>
+    </w:p>
+    <w:p>
+      <w:pPr>
+        <w:spacing w:after="160" w:line="300" w:lineRule="auto"/>
+      </w:pPr>
+      <w:r>
+        <w:rPr>
+          <w:b w:val="0"/>
+          <w:i w:val="0"/>
+          <w:sz w:val="21"/>
+        </w:rPr>
+        <w:t>Pulled these directly from Alibaba (verified suppliers) and official distributor pages, not generic wholesale estimates. Prices below are real listed bulk-tier prices as of Aug 15, 2026 — noticeably cheaper than the planning estimates in Sections 1-2 above, so treat those sections as the conservative ceiling and this section as the realistic floor.</w:t>
+      </w:r>
+    </w:p>
+    <w:tbl>
+      <w:tblPr>
+        <w:tblStyle w:val="TableGrid"/>
+        <w:tblW w:type="auto" w:w="0"/>
+        <w:jc w:val="center"/>
+        <w:tblLook w:firstColumn="1" w:firstRow="1" w:lastColumn="0" w:lastRow="0" w:noHBand="0" w:noVBand="1" w:val="04A0"/>
+      </w:tblPr>
+      <w:tblGrid>
+        <w:gridCol w:w="3312"/>
+        <w:gridCol w:w="3312"/>
+        <w:gridCol w:w="3312"/>
+      </w:tblGrid>
+      <w:tr>
+        <w:tc>
+          <w:tcPr>
+            <w:tcW w:type="dxa" w:w="3312"/>
+            <w:shd w:val="clear" w:color="auto" w:fill="0B1F3A"/>
+          </w:tcPr>
+          <w:p>
+            <w:r/>
+            <w:r>
+              <w:rPr>
+                <w:b/>
+                <w:color w:val="FFFFFF"/>
+                <w:sz w:val="18"/>
+              </w:rPr>
+              <w:t>Component</w:t>
+            </w:r>
+          </w:p>
+        </w:tc>
+        <w:tc>
+          <w:tcPr>
+            <w:tcW w:type="dxa" w:w="3312"/>
+            <w:shd w:val="clear" w:color="auto" w:fill="0B1F3A"/>
+          </w:tcPr>
+          <w:p>
+            <w:r/>
+            <w:r>
+              <w:rPr>
+                <w:b/>
+                <w:color w:val="FFFFFF"/>
+                <w:sz w:val="18"/>
+              </w:rPr>
+              <w:t>Where to Buy</w:t>
+            </w:r>
+          </w:p>
+        </w:tc>
+        <w:tc>
+          <w:tcPr>
+            <w:tcW w:type="dxa" w:w="3312"/>
+            <w:shd w:val="clear" w:color="auto" w:fill="0B1F3A"/>
+          </w:tcPr>
+          <w:p>
+            <w:r/>
+            <w:r>
+              <w:rPr>
+                <w:b/>
+                <w:color w:val="FFFFFF"/>
+                <w:sz w:val="18"/>
+              </w:rPr>
+              <w:t>Real Bulk Price</w:t>
+            </w:r>
+          </w:p>
+        </w:tc>
+      </w:tr>
+      <w:tr>
+        <w:tc>
+          <w:tcPr>
+            <w:tcW w:type="dxa" w:w="3312"/>
+          </w:tcPr>
+          <w:p>
+            <w:r/>
+            <w:r>
+              <w:rPr>
+                <w:sz w:val="18"/>
+              </w:rPr>
+              <w:t>Base Android POS terminal</w:t>
+              <w:br/>
+              <w:t>(display, MCU, NFC built-in, enclosure)</w:t>
+            </w:r>
+          </w:p>
+        </w:tc>
+        <w:tc>
+          <w:tcPr>
+            <w:tcW w:type="dxa" w:w="3312"/>
+          </w:tcPr>
+          <w:p>
+            <w:r/>
+            <w:r>
+              <w:rPr>
+                <w:sz w:val="18"/>
+              </w:rPr>
+              <w:t>alibaba.com/product-detail/OEM-ODM-Android-11-Handheld-POS_1601698319159.html</w:t>
+            </w:r>
+          </w:p>
+        </w:tc>
+        <w:tc>
+          <w:tcPr>
+            <w:tcW w:type="dxa" w:w="3312"/>
+          </w:tcPr>
+          <w:p>
+            <w:r/>
+            <w:r>
+              <w:rPr>
+                <w:sz w:val="18"/>
+              </w:rPr>
+              <w:t>$71 at 500-2999 pcs</w:t>
+              <w:br/>
+              <w:t>$68 at 3000+ pcs</w:t>
+            </w:r>
+          </w:p>
+        </w:tc>
+      </w:tr>
+      <w:tr>
+        <w:tc>
+          <w:tcPr>
+            <w:tcW w:type="dxa" w:w="3312"/>
+          </w:tcPr>
+          <w:p>
+            <w:r/>
+            <w:r>
+              <w:rPr>
+                <w:sz w:val="18"/>
+              </w:rPr>
+              <w:t>Cheaper terminal alternative</w:t>
+              <w:br/>
+              <w:t>(basic NFC Android POS)</w:t>
+            </w:r>
+          </w:p>
+        </w:tc>
+        <w:tc>
+          <w:tcPr>
+            <w:tcW w:type="dxa" w:w="3312"/>
+          </w:tcPr>
+          <w:p>
+            <w:r/>
+            <w:r>
+              <w:rPr>
+                <w:sz w:val="18"/>
+              </w:rPr>
+              <w:t>alibaba.com/product-detail/Z91-ODM-All-One-POS-System_1600488866496.html</w:t>
+            </w:r>
+          </w:p>
+        </w:tc>
+        <w:tc>
+          <w:tcPr>
+            <w:tcW w:type="dxa" w:w="3312"/>
+          </w:tcPr>
+          <w:p>
+            <w:r/>
+            <w:r>
+              <w:rPr>
+                <w:sz w:val="18"/>
+              </w:rPr>
+              <w:t>$65 at 2000+ pcs</w:t>
+            </w:r>
+          </w:p>
+        </w:tc>
+      </w:tr>
+      <w:tr>
+        <w:tc>
+          <w:tcPr>
+            <w:tcW w:type="dxa" w:w="3312"/>
+          </w:tcPr>
+          <w:p>
+            <w:r/>
+            <w:r>
+              <w:rPr>
+                <w:sz w:val="18"/>
+              </w:rPr>
+              <w:t>Secure element / hardware</w:t>
+              <w:br/>
+              <w:t>root-of-trust chip (ATECC608B)</w:t>
+            </w:r>
+          </w:p>
+        </w:tc>
+        <w:tc>
+          <w:tcPr>
+            <w:tcW w:type="dxa" w:w="3312"/>
+          </w:tcPr>
+          <w:p>
+            <w:r/>
+            <w:r>
+              <w:rPr>
+                <w:sz w:val="18"/>
+              </w:rPr>
+              <w:t>lcsc.com/product-detail/C1518773.html (China distributor, ships with other Shenzhen orders)</w:t>
+            </w:r>
+          </w:p>
+        </w:tc>
+        <w:tc>
+          <w:tcPr>
+            <w:tcW w:type="dxa" w:w="3312"/>
+          </w:tcPr>
+          <w:p>
+            <w:r/>
+            <w:r>
+              <w:rPr>
+                <w:sz w:val="18"/>
+              </w:rPr>
+              <w:t>from $1.01/unit</w:t>
+            </w:r>
+          </w:p>
+        </w:tc>
+      </w:tr>
+      <w:tr>
+        <w:tc>
+          <w:tcPr>
+            <w:tcW w:type="dxa" w:w="3312"/>
+          </w:tcPr>
+          <w:p>
+            <w:r/>
+            <w:r>
+              <w:rPr>
+                <w:sz w:val="18"/>
+              </w:rPr>
+              <w:t>Secure element — official channel</w:t>
+            </w:r>
+          </w:p>
+        </w:tc>
+        <w:tc>
+          <w:tcPr>
+            <w:tcW w:type="dxa" w:w="3312"/>
+          </w:tcPr>
+          <w:p>
+            <w:r/>
+            <w:r>
+              <w:rPr>
+                <w:sz w:val="18"/>
+              </w:rPr>
+              <w:t>mouser.com — search ATECC608B-RBHCZ-B</w:t>
+            </w:r>
+          </w:p>
+        </w:tc>
+        <w:tc>
+          <w:tcPr>
+            <w:tcW w:type="dxa" w:w="3312"/>
+          </w:tcPr>
+          <w:p>
+            <w:r/>
+            <w:r>
+              <w:rPr>
+                <w:sz w:val="18"/>
+              </w:rPr>
+              <w:t>$1.23/unit</w:t>
+            </w:r>
+          </w:p>
+        </w:tc>
+      </w:tr>
+      <w:tr>
+        <w:tc>
+          <w:tcPr>
+            <w:tcW w:type="dxa" w:w="3312"/>
+          </w:tcPr>
+          <w:p>
+            <w:r/>
+            <w:r>
+              <w:rPr>
+                <w:sz w:val="18"/>
+              </w:rPr>
+              <w:t>Secure element — direct from manufacturer</w:t>
+            </w:r>
+          </w:p>
+        </w:tc>
+        <w:tc>
+          <w:tcPr>
+            <w:tcW w:type="dxa" w:w="3312"/>
+          </w:tcPr>
+          <w:p>
+            <w:r/>
+            <w:r>
+              <w:rPr>
+                <w:sz w:val="18"/>
+              </w:rPr>
+              <w:t>microchip.com/en-us/product/atecc608b (requires approved quote for bulk)</w:t>
+            </w:r>
+          </w:p>
+        </w:tc>
+        <w:tc>
+          <w:tcPr>
+            <w:tcW w:type="dxa" w:w="3312"/>
+          </w:tcPr>
+          <w:p>
+            <w:r/>
+            <w:r>
+              <w:rPr>
+                <w:sz w:val="18"/>
+              </w:rPr>
+              <w:t>$0.66/unit</w:t>
+            </w:r>
+          </w:p>
+        </w:tc>
+      </w:tr>
+      <w:tr>
+        <w:tc>
+          <w:tcPr>
+            <w:tcW w:type="dxa" w:w="3312"/>
+          </w:tcPr>
+          <w:p>
+            <w:r/>
+            <w:r>
+              <w:rPr>
+                <w:sz w:val="18"/>
+              </w:rPr>
+              <w:t>Solar panel, 20W monocrystalline</w:t>
+            </w:r>
+          </w:p>
+        </w:tc>
+        <w:tc>
+          <w:tcPr>
+            <w:tcW w:type="dxa" w:w="3312"/>
+          </w:tcPr>
+          <w:p>
+            <w:r/>
+            <w:r>
+              <w:rPr>
+                <w:sz w:val="18"/>
+              </w:rPr>
+              <w:t>alibaba.com/product-detail/20-Watt-Pv-Solar-Panel-Module_1601121274092.html</w:t>
+            </w:r>
+          </w:p>
+        </w:tc>
+        <w:tc>
+          <w:tcPr>
+            <w:tcW w:type="dxa" w:w="3312"/>
+          </w:tcPr>
+          <w:p>
+            <w:r/>
+            <w:r>
+              <w:rPr>
+                <w:sz w:val="18"/>
+              </w:rPr>
+              <w:t>$9.50 at 500-999 pcs</w:t>
+              <w:br/>
+              <w:t>$9.00 at 1000+ pcs</w:t>
+            </w:r>
+          </w:p>
+        </w:tc>
+      </w:tr>
+      <w:tr>
+        <w:tc>
+          <w:tcPr>
+            <w:tcW w:type="dxa" w:w="3312"/>
+          </w:tcPr>
+          <w:p>
+            <w:r/>
+            <w:r>
+              <w:rPr>
+                <w:sz w:val="18"/>
+              </w:rPr>
+              <w:t>LiFePO4 battery, 12V 20Ah</w:t>
+            </w:r>
+          </w:p>
+        </w:tc>
+        <w:tc>
+          <w:tcPr>
+            <w:tcW w:type="dxa" w:w="3312"/>
+          </w:tcPr>
+          <w:p>
+            <w:r/>
+            <w:r>
+              <w:rPr>
+                <w:sz w:val="18"/>
+              </w:rPr>
+              <w:t>alibaba.com/product-detail/High-Quality-12V20Ah-LiFePO4-Battery-Rechargeable_1600562865907.html</w:t>
+            </w:r>
+          </w:p>
+        </w:tc>
+        <w:tc>
+          <w:tcPr>
+            <w:tcW w:type="dxa" w:w="3312"/>
+          </w:tcPr>
+          <w:p>
+            <w:r/>
+            <w:r>
+              <w:rPr>
+                <w:sz w:val="18"/>
+              </w:rPr>
+              <w:t>$25 at 500-999 pcs</w:t>
+              <w:br/>
+              <w:t>cheaper at 1000+</w:t>
+            </w:r>
+          </w:p>
+        </w:tc>
+      </w:tr>
+      <w:tr>
+        <w:tc>
+          <w:tcPr>
+            <w:tcW w:type="dxa" w:w="3312"/>
+          </w:tcPr>
+          <w:p>
+            <w:r/>
+            <w:r>
+              <w:rPr>
+                <w:sz w:val="18"/>
+              </w:rPr>
+              <w:t>LiFePO4 battery — with built-in BMS</w:t>
+            </w:r>
+          </w:p>
+        </w:tc>
+        <w:tc>
+          <w:tcPr>
+            <w:tcW w:type="dxa" w:w="3312"/>
+          </w:tcPr>
+          <w:p>
+            <w:r/>
+            <w:r>
+              <w:rPr>
+                <w:sz w:val="18"/>
+              </w:rPr>
+              <w:t>ranking.alibaba.com/lithium-battery-20kw.html — '12V 20AH LiFePO4 with 30A BMS'</w:t>
+            </w:r>
+          </w:p>
+        </w:tc>
+        <w:tc>
+          <w:tcPr>
+            <w:tcW w:type="dxa" w:w="3312"/>
+          </w:tcPr>
+          <w:p>
+            <w:r/>
+            <w:r>
+              <w:rPr>
+                <w:sz w:val="18"/>
+              </w:rPr>
+              <w:t>$54.99 (small lot; bulk lower)</w:t>
+            </w:r>
+          </w:p>
+        </w:tc>
+      </w:tr>
+      <w:tr>
+        <w:tc>
+          <w:tcPr>
+            <w:tcW w:type="dxa" w:w="3312"/>
+          </w:tcPr>
+          <w:p>
+            <w:r/>
+            <w:r>
+              <w:rPr>
+                <w:sz w:val="18"/>
+              </w:rPr>
+              <w:t>LoRa mesh radio module (long-range)</w:t>
+            </w:r>
+          </w:p>
+        </w:tc>
+        <w:tc>
+          <w:tcPr>
+            <w:tcW w:type="dxa" w:w="3312"/>
+          </w:tcPr>
+          <w:p>
+            <w:r/>
+            <w:r>
+              <w:rPr>
+                <w:sz w:val="18"/>
+              </w:rPr>
+              <w:t>alibaba.com/product-detail/g-nicerf-mesh-network-5km-sx127x_1600499266660.html</w:t>
+            </w:r>
+          </w:p>
+        </w:tc>
+        <w:tc>
+          <w:tcPr>
+            <w:tcW w:type="dxa" w:w="3312"/>
+          </w:tcPr>
+          <w:p>
+            <w:r/>
+            <w:r>
+              <w:rPr>
+                <w:sz w:val="18"/>
+              </w:rPr>
+              <w:t>true mesh networking, ~5km range</w:t>
+            </w:r>
+          </w:p>
+        </w:tc>
+      </w:tr>
+      <w:tr>
+        <w:tc>
+          <w:tcPr>
+            <w:tcW w:type="dxa" w:w="3312"/>
+          </w:tcPr>
+          <w:p>
+            <w:r/>
+            <w:r>
+              <w:rPr>
+                <w:sz w:val="18"/>
+              </w:rPr>
+              <w:t>LoRa module — cheaper generic</w:t>
+            </w:r>
+          </w:p>
+        </w:tc>
+        <w:tc>
+          <w:tcPr>
+            <w:tcW w:type="dxa" w:w="3312"/>
+          </w:tcPr>
+          <w:p>
+            <w:r/>
+            <w:r>
+              <w:rPr>
+                <w:sz w:val="18"/>
+              </w:rPr>
+              <w:t>alibaba.com/wholesale/high-power-lora-module.html</w:t>
+            </w:r>
+          </w:p>
+        </w:tc>
+        <w:tc>
+          <w:tcPr>
+            <w:tcW w:type="dxa" w:w="3312"/>
+          </w:tcPr>
+          <w:p>
+            <w:r/>
+            <w:r>
+              <w:rPr>
+                <w:sz w:val="18"/>
+              </w:rPr>
+              <w:t>$7.50-10/unit, MOQ 5</w:t>
+            </w:r>
+          </w:p>
+        </w:tc>
+      </w:tr>
+    </w:tbl>
+    <w:p>
+      <w:pPr>
+        <w:spacing w:after="120"/>
+      </w:pPr>
+    </w:p>
+    <w:p>
+      <w:pPr>
+        <w:spacing w:after="200"/>
+      </w:pPr>
+      <w:r>
+        <w:rPr>
+          <w:i/>
+          <w:color w:val="B00000"/>
+          <w:sz w:val="20"/>
+        </w:rPr>
+        <w:t>NOTE: With these real prices: a terminal (base ODM $68-71 + secure element ~$1) lands around $69-72 factory-side, before freight/duty/VAT. A hub (panel $9-9.50 + battery $25-55 + LoRa module $8-10 + controller/enclosure ~$25) lands around $70-100 factory-side before freight/duty/VAT. This is meaningfully cheaper than the planning estimates in Sections 1-2 — real supplier quotes should replace those once you're ready to actually order, and the $34,000 Kwati-facing hardware figure has even more real margin in it than first estimated.</w:t>
+      </w:r>
+    </w:p>
+    <w:p>
+      <w:pPr>
+        <w:spacing w:after="160" w:line="300" w:lineRule="auto"/>
+      </w:pPr>
+      <w:r>
+        <w:rPr>
+          <w:b w:val="0"/>
+          <w:i/>
+          <w:color w:val="555555"/>
+          <w:sz w:val="21"/>
+        </w:rPr>
+        <w:t>All links are live Alibaba/distributor product or category pages — verify supplier ratings, request samples, and confirm MOQ/shipping terms directly before placing any bulk order. These are sourcing starting points, not vetted/approved suppliers yet.</w:t>
+      </w:r>
+    </w:p>
     <w:sectPr>
       <w:pgSz w:w="12240" w:h="15840"/>
       <w:pgMar w:top="1440" w:right="1152" w:bottom="1440" w:left="1152" w:header="720" w:footer="720" w:gutter="0"/>

</xml_diff>